<commit_message>
docs: expand Proximate platform update with full IT/ops setup checklist
Broaden the 'still open' section into an owner-tagged setup checklist for
Adeso IT / Meta: daily DB backups (do-first), off-site pg_dump copy, R2
object storage, outbound email, full sanctions sweep, WhatsApp-on-Meta
chain (portfolio + templates + env vars), uptime monitoring, and the
in-app AI spend cap.

Co-Authored-By: Claude Opus 4.8 <noreply@anthropic.com>
</commit_message>
<xml_diff>
--- a/docs/Platform_Update_Proximate_27_July_2026.docx
+++ b/docs/Platform_Update_Proximate_27_July_2026.docx
@@ -742,7 +742,7 @@
         <w:pStyle w:val="Heading1"/>
       </w:pPr>
       <w:r>
-        <w:t>Still open — carried over from 24 July</w:t>
+        <w:t>Setup still needed — for Adeso IT and Meta</w:t>
       </w:r>
     </w:p>
     <w:tbl>
@@ -769,7 +769,7 @@
                 <w:color w:val="C2410C"/>
                 <w:sz w:val="20"/>
               </w:rPr>
-              <w:t xml:space="preserve">Needs someone — </w:t>
+              <w:t xml:space="preserve">Do this first — </w:t>
             </w:r>
             <w:r>
               <w:rPr>
@@ -777,7 +777,7 @@
                 <w:color w:val="1A1410"/>
                 <w:sz w:val="20"/>
               </w:rPr>
-              <w:t>The weekly backup job for the Proximate data still has not run. The live fund holds 62 real partners and roughly 100 documents. The job exists and is correct; it needs someone with GitHub access to enable it, and it is a ten-minute task. This remains the highest-value open item on the list.</w:t>
+              <w:t>Turn on the daily database backup. The live fund holds 62 real partners and roughly 100 documents, and none of it is currently backed up. The job exists and is correct; it needs someone with access to the Railway service to enable it, and it is a ten-minute task. It is the highest-value item on this page by a wide margin.</w:t>
             </w:r>
           </w:p>
         </w:tc>
@@ -800,7 +800,7 @@
           <w:color w:val="1A1410"/>
           <w:sz w:val="21"/>
         </w:rPr>
-        <w:t>These items are not code and were not part of this wave. They stand as they did in the 24 July update; none was revisited here.</w:t>
+        <w:t>None of the items below are development work. Each is an account, a key, or an approval that sits with IT or with Meta — not with us. They are the reason a few things the platform can already do are not yet doing them in production. They stand roughly as they did at the 24 July update; none was revisited in this wave.</w:t>
       </w:r>
     </w:p>
     <w:tbl>
@@ -817,7 +817,7 @@
       <w:tr>
         <w:tc>
           <w:tcPr>
-            <w:tcW w:type="dxa" w:w="3024"/>
+            <w:tcW w:type="dxa" w:w="3384"/>
             <w:shd w:val="clear" w:fill="7C2D12"/>
           </w:tcPr>
           <w:p>
@@ -832,13 +832,13 @@
                 <w:color w:val="FFFFFF"/>
                 <w:sz w:val="20"/>
               </w:rPr>
-              <w:t>Item</w:t>
+              <w:t>What is needed</w:t>
             </w:r>
           </w:p>
         </w:tc>
         <w:tc>
           <w:tcPr>
-            <w:tcW w:type="dxa" w:w="1584"/>
+            <w:tcW w:type="dxa" w:w="1656"/>
             <w:shd w:val="clear" w:fill="7C2D12"/>
           </w:tcPr>
           <w:p>
@@ -859,7 +859,7 @@
         </w:tc>
         <w:tc>
           <w:tcPr>
-            <w:tcW w:type="dxa" w:w="5184"/>
+            <w:tcW w:type="dxa" w:w="4752"/>
             <w:shd w:val="clear" w:fill="7C2D12"/>
           </w:tcPr>
           <w:p>
@@ -882,7 +882,7 @@
       <w:tr>
         <w:tc>
           <w:tcPr>
-            <w:tcW w:type="dxa" w:w="3024"/>
+            <w:tcW w:type="dxa" w:w="3384"/>
           </w:tcPr>
           <w:p>
             <w:pPr>
@@ -896,13 +896,13 @@
                 <w:color w:val="1A1410"/>
                 <w:sz w:val="20"/>
               </w:rPr>
-              <w:t>Weekly backup has never run</w:t>
+              <w:t>Daily database backups — not enabled</w:t>
             </w:r>
           </w:p>
         </w:tc>
         <w:tc>
           <w:tcPr>
-            <w:tcW w:type="dxa" w:w="1584"/>
+            <w:tcW w:type="dxa" w:w="1656"/>
           </w:tcPr>
           <w:p>
             <w:pPr>
@@ -916,13 +916,13 @@
                 <w:color w:val="1A1410"/>
                 <w:sz w:val="20"/>
               </w:rPr>
-              <w:t>IT / GitHub</w:t>
+              <w:t>IT · Railway</w:t>
             </w:r>
           </w:p>
         </w:tc>
         <w:tc>
           <w:tcPr>
-            <w:tcW w:type="dxa" w:w="5184"/>
+            <w:tcW w:type="dxa" w:w="4752"/>
           </w:tcPr>
           <w:p>
             <w:pPr>
@@ -936,7 +936,7 @@
                 <w:color w:val="1A1410"/>
                 <w:sz w:val="20"/>
               </w:rPr>
-              <w:t>The job is written and correct but absent from the run history — unstarted, not failing. 62 real partners and ~100 documents currently unbacked-up.</w:t>
+              <w:t>Enable Railway’s daily Postgres backups with 30-day retention. 62 real partners and ~100 documents are currently unbacked-up. A ten-minute task and the first thing to do.</w:t>
             </w:r>
           </w:p>
         </w:tc>
@@ -944,7 +944,7 @@
       <w:tr>
         <w:tc>
           <w:tcPr>
-            <w:tcW w:type="dxa" w:w="3024"/>
+            <w:tcW w:type="dxa" w:w="3384"/>
           </w:tcPr>
           <w:p>
             <w:pPr>
@@ -958,13 +958,13 @@
                 <w:color w:val="1A1410"/>
                 <w:sz w:val="20"/>
               </w:rPr>
-              <w:t>Full sanctions sweep has never run</w:t>
+              <w:t>Off-site backup copy — not running</w:t>
             </w:r>
           </w:p>
         </w:tc>
         <w:tc>
           <w:tcPr>
-            <w:tcW w:type="dxa" w:w="1584"/>
+            <w:tcW w:type="dxa" w:w="1656"/>
           </w:tcPr>
           <w:p>
             <w:pPr>
@@ -978,13 +978,13 @@
                 <w:color w:val="1A1410"/>
                 <w:sz w:val="20"/>
               </w:rPr>
-              <w:t>IT / GitHub</w:t>
+              <w:t>IT · GitHub</w:t>
             </w:r>
           </w:p>
         </w:tc>
         <w:tc>
           <w:tcPr>
-            <w:tcW w:type="dxa" w:w="5184"/>
+            <w:tcW w:type="dxa" w:w="4752"/>
           </w:tcPr>
           <w:p>
             <w:pPr>
@@ -998,7 +998,7 @@
                 <w:color w:val="1A1410"/>
                 <w:sz w:val="20"/>
               </w:rPr>
-              <w:t>The Monday re-screen does run; the full sweep does not.</w:t>
+              <w:t>A weekly database dump to object storage is written as a job but has never run. It needs the object storage below to exist first, then to be switched on.</w:t>
             </w:r>
           </w:p>
         </w:tc>
@@ -1006,7 +1006,7 @@
       <w:tr>
         <w:tc>
           <w:tcPr>
-            <w:tcW w:type="dxa" w:w="3024"/>
+            <w:tcW w:type="dxa" w:w="3384"/>
           </w:tcPr>
           <w:p>
             <w:pPr>
@@ -1020,13 +1020,13 @@
                 <w:color w:val="1A1410"/>
                 <w:sz w:val="20"/>
               </w:rPr>
-              <w:t>Outbound email not configured</w:t>
+              <w:t>Object storage (Cloudflare R2) — not provisioned</w:t>
             </w:r>
           </w:p>
         </w:tc>
         <w:tc>
           <w:tcPr>
-            <w:tcW w:type="dxa" w:w="1584"/>
+            <w:tcW w:type="dxa" w:w="1656"/>
           </w:tcPr>
           <w:p>
             <w:pPr>
@@ -1046,7 +1046,7 @@
         </w:tc>
         <w:tc>
           <w:tcPr>
-            <w:tcW w:type="dxa" w:w="5184"/>
+            <w:tcW w:type="dxa" w:w="4752"/>
           </w:tcPr>
           <w:p>
             <w:pPr>
@@ -1060,7 +1060,7 @@
                 <w:color w:val="1A1410"/>
                 <w:sz w:val="20"/>
               </w:rPr>
-              <w:t>No SMTP or SendGrid on the production service. Anything the system would send by email goes nowhere. WhatsApp and SMS are unaffected and work.</w:t>
+              <w:t>Uploaded documents and evidence photos currently sit on the service’s own disk. Create an R2 bucket (proximate-evidence) and an API token, set three environment variables (S3_ENDPOINT, S3_ACCESS_KEY, S3_SECRET_KEY) on the Railway service, and the existing evidence is then migrated across.</w:t>
             </w:r>
           </w:p>
         </w:tc>
@@ -1068,7 +1068,7 @@
       <w:tr>
         <w:tc>
           <w:tcPr>
-            <w:tcW w:type="dxa" w:w="3024"/>
+            <w:tcW w:type="dxa" w:w="3384"/>
           </w:tcPr>
           <w:p>
             <w:pPr>
@@ -1082,75 +1082,13 @@
                 <w:color w:val="1A1410"/>
                 <w:sz w:val="20"/>
               </w:rPr>
-              <w:t>WhatsApp templates pending</w:t>
+              <w:t>Outbound email — not configured</w:t>
             </w:r>
           </w:p>
         </w:tc>
         <w:tc>
           <w:tcPr>
-            <w:tcW w:type="dxa" w:w="1584"/>
-          </w:tcPr>
-          <w:p>
-            <w:pPr>
-              <w:spacing w:after="40"/>
-            </w:pPr>
-            <w:r/>
-            <w:r>
-              <w:rPr>
-                <w:rFonts w:ascii="Arial" w:hAnsi="Arial"/>
-                <w:b w:val="0"/>
-                <w:color w:val="1A1410"/>
-                <w:sz w:val="20"/>
-              </w:rPr>
-              <w:t>Meta</w:t>
-            </w:r>
-          </w:p>
-        </w:tc>
-        <w:tc>
-          <w:tcPr>
-            <w:tcW w:type="dxa" w:w="5184"/>
-          </w:tcPr>
-          <w:p>
-            <w:pPr>
-              <w:spacing w:after="40"/>
-            </w:pPr>
-            <w:r/>
-            <w:r>
-              <w:rPr>
-                <w:rFonts w:ascii="Arial" w:hAnsi="Arial"/>
-                <w:b w:val="0"/>
-                <w:color w:val="1A1410"/>
-                <w:sz w:val="20"/>
-              </w:rPr>
-              <w:t>The sender number is live and messaging works. Six utility templates still await Meta approval; until they clear, some automated sends fall back to SMS.</w:t>
-            </w:r>
-          </w:p>
-        </w:tc>
-      </w:tr>
-      <w:tr>
-        <w:tc>
-          <w:tcPr>
-            <w:tcW w:type="dxa" w:w="3024"/>
-          </w:tcPr>
-          <w:p>
-            <w:pPr>
-              <w:spacing w:after="40"/>
-            </w:pPr>
-            <w:r/>
-            <w:r>
-              <w:rPr>
-                <w:rFonts w:ascii="Arial" w:hAnsi="Arial"/>
-                <w:b w:val="0"/>
-                <w:color w:val="1A1410"/>
-                <w:sz w:val="20"/>
-              </w:rPr>
-              <w:t>Object storage not configured</w:t>
-            </w:r>
-          </w:p>
-        </w:tc>
-        <w:tc>
-          <w:tcPr>
-            <w:tcW w:type="dxa" w:w="1584"/>
+            <w:tcW w:type="dxa" w:w="1656"/>
           </w:tcPr>
           <w:p>
             <w:pPr>
@@ -1170,7 +1108,7 @@
         </w:tc>
         <w:tc>
           <w:tcPr>
-            <w:tcW w:type="dxa" w:w="5184"/>
+            <w:tcW w:type="dxa" w:w="4752"/>
           </w:tcPr>
           <w:p>
             <w:pPr>
@@ -1184,7 +1122,255 @@
                 <w:color w:val="1A1410"/>
                 <w:sz w:val="20"/>
               </w:rPr>
-              <w:t>Uploaded documents and evidence photos sit on the service’s own disk rather than in object storage. It works, but is not where this should sit long term.</w:t>
+              <w:t>There is no email configuration on the production service — no SMTP, no SendGrid. Anything the system would send by email is silently going nowhere. WhatsApp and SMS are unaffected and work. One provider key on Railway fixes it.</w:t>
+            </w:r>
+          </w:p>
+        </w:tc>
+      </w:tr>
+      <w:tr>
+        <w:tc>
+          <w:tcPr>
+            <w:tcW w:type="dxa" w:w="3384"/>
+          </w:tcPr>
+          <w:p>
+            <w:pPr>
+              <w:spacing w:after="40"/>
+            </w:pPr>
+            <w:r/>
+            <w:r>
+              <w:rPr>
+                <w:rFonts w:ascii="Arial" w:hAnsi="Arial"/>
+                <w:b w:val="0"/>
+                <w:color w:val="1A1410"/>
+                <w:sz w:val="20"/>
+              </w:rPr>
+              <w:t>Full sanctions sweep — never run</w:t>
+            </w:r>
+          </w:p>
+        </w:tc>
+        <w:tc>
+          <w:tcPr>
+            <w:tcW w:type="dxa" w:w="1656"/>
+          </w:tcPr>
+          <w:p>
+            <w:pPr>
+              <w:spacing w:after="40"/>
+            </w:pPr>
+            <w:r/>
+            <w:r>
+              <w:rPr>
+                <w:rFonts w:ascii="Arial" w:hAnsi="Arial"/>
+                <w:b w:val="0"/>
+                <w:color w:val="1A1410"/>
+                <w:sz w:val="20"/>
+              </w:rPr>
+              <w:t>IT · GitHub</w:t>
+            </w:r>
+          </w:p>
+        </w:tc>
+        <w:tc>
+          <w:tcPr>
+            <w:tcW w:type="dxa" w:w="4752"/>
+          </w:tcPr>
+          <w:p>
+            <w:pPr>
+              <w:spacing w:after="40"/>
+            </w:pPr>
+            <w:r/>
+            <w:r>
+              <w:rPr>
+                <w:rFonts w:ascii="Arial" w:hAnsi="Arial"/>
+                <w:b w:val="0"/>
+                <w:color w:val="1A1410"/>
+                <w:sz w:val="20"/>
+              </w:rPr>
+              <w:t>The Monday re-screen does run; the full periodic sweep does not. Same kind of one-off enablement as the backup.</w:t>
+            </w:r>
+          </w:p>
+        </w:tc>
+      </w:tr>
+      <w:tr>
+        <w:tc>
+          <w:tcPr>
+            <w:tcW w:type="dxa" w:w="3384"/>
+          </w:tcPr>
+          <w:p>
+            <w:pPr>
+              <w:spacing w:after="40"/>
+            </w:pPr>
+            <w:r/>
+            <w:r>
+              <w:rPr>
+                <w:rFonts w:ascii="Arial" w:hAnsi="Arial"/>
+                <w:b w:val="0"/>
+                <w:color w:val="1A1410"/>
+                <w:sz w:val="20"/>
+              </w:rPr>
+              <w:t>WhatsApp on Meta’s own channel — pending</w:t>
+            </w:r>
+          </w:p>
+        </w:tc>
+        <w:tc>
+          <w:tcPr>
+            <w:tcW w:type="dxa" w:w="1656"/>
+          </w:tcPr>
+          <w:p>
+            <w:pPr>
+              <w:spacing w:after="40"/>
+            </w:pPr>
+            <w:r/>
+            <w:r>
+              <w:rPr>
+                <w:rFonts w:ascii="Arial" w:hAnsi="Arial"/>
+                <w:b w:val="0"/>
+                <w:color w:val="1A1410"/>
+                <w:sz w:val="20"/>
+              </w:rPr>
+              <w:t>Adeso · Meta</w:t>
+            </w:r>
+          </w:p>
+        </w:tc>
+        <w:tc>
+          <w:tcPr>
+            <w:tcW w:type="dxa" w:w="4752"/>
+          </w:tcPr>
+          <w:p>
+            <w:pPr>
+              <w:spacing w:after="40"/>
+            </w:pPr>
+            <w:r/>
+            <w:r>
+              <w:rPr>
+                <w:rFonts w:ascii="Arial" w:hAnsi="Arial"/>
+                <w:b w:val="0"/>
+                <w:color w:val="1A1410"/>
+                <w:sz w:val="20"/>
+              </w:rPr>
+              <w:t>The sender number is live and messaging works today over the SMS fallback. To move automated messages onto WhatsApp proper: a Meta Business Portfolio and WhatsApp Business Account for Adeso, six utility templates registered in Meta (each ~24h approval), and two environment variables (WHATSAPP_PHONE_NUMBER_ID, WHATSAPP_ACCESS_TOKEN). Several automated reminders are waiting on this.</w:t>
+            </w:r>
+          </w:p>
+        </w:tc>
+      </w:tr>
+      <w:tr>
+        <w:tc>
+          <w:tcPr>
+            <w:tcW w:type="dxa" w:w="3384"/>
+          </w:tcPr>
+          <w:p>
+            <w:pPr>
+              <w:spacing w:after="40"/>
+            </w:pPr>
+            <w:r/>
+            <w:r>
+              <w:rPr>
+                <w:rFonts w:ascii="Arial" w:hAnsi="Arial"/>
+                <w:b w:val="0"/>
+                <w:color w:val="1A1410"/>
+                <w:sz w:val="20"/>
+              </w:rPr>
+              <w:t>Uptime monitoring — not set up</w:t>
+            </w:r>
+          </w:p>
+        </w:tc>
+        <w:tc>
+          <w:tcPr>
+            <w:tcW w:type="dxa" w:w="1656"/>
+          </w:tcPr>
+          <w:p>
+            <w:pPr>
+              <w:spacing w:after="40"/>
+            </w:pPr>
+            <w:r/>
+            <w:r>
+              <w:rPr>
+                <w:rFonts w:ascii="Arial" w:hAnsi="Arial"/>
+                <w:b w:val="0"/>
+                <w:color w:val="1A1410"/>
+                <w:sz w:val="20"/>
+              </w:rPr>
+              <w:t>IT</w:t>
+            </w:r>
+          </w:p>
+        </w:tc>
+        <w:tc>
+          <w:tcPr>
+            <w:tcW w:type="dxa" w:w="4752"/>
+          </w:tcPr>
+          <w:p>
+            <w:pPr>
+              <w:spacing w:after="40"/>
+            </w:pPr>
+            <w:r/>
+            <w:r>
+              <w:rPr>
+                <w:rFonts w:ascii="Arial" w:hAnsi="Arial"/>
+                <w:b w:val="0"/>
+                <w:color w:val="1A1410"/>
+                <w:sz w:val="20"/>
+              </w:rPr>
+              <w:t>A free BetterStack (or similar) check on /health plus one per-tenant probe, so an outage pages someone rather than waiting to be noticed.</w:t>
+            </w:r>
+          </w:p>
+        </w:tc>
+      </w:tr>
+      <w:tr>
+        <w:tc>
+          <w:tcPr>
+            <w:tcW w:type="dxa" w:w="3384"/>
+          </w:tcPr>
+          <w:p>
+            <w:pPr>
+              <w:spacing w:after="40"/>
+            </w:pPr>
+            <w:r/>
+            <w:r>
+              <w:rPr>
+                <w:rFonts w:ascii="Arial" w:hAnsi="Arial"/>
+                <w:b w:val="0"/>
+                <w:color w:val="1A1410"/>
+                <w:sz w:val="20"/>
+              </w:rPr>
+              <w:t>AI spend cap — unset</w:t>
+            </w:r>
+          </w:p>
+        </w:tc>
+        <w:tc>
+          <w:tcPr>
+            <w:tcW w:type="dxa" w:w="1656"/>
+          </w:tcPr>
+          <w:p>
+            <w:pPr>
+              <w:spacing w:after="40"/>
+            </w:pPr>
+            <w:r/>
+            <w:r>
+              <w:rPr>
+                <w:rFonts w:ascii="Arial" w:hAnsi="Arial"/>
+                <w:b w:val="0"/>
+                <w:color w:val="1A1410"/>
+                <w:sz w:val="20"/>
+              </w:rPr>
+              <w:t>Oversight Body</w:t>
+            </w:r>
+          </w:p>
+        </w:tc>
+        <w:tc>
+          <w:tcPr>
+            <w:tcW w:type="dxa" w:w="4752"/>
+          </w:tcPr>
+          <w:p>
+            <w:pPr>
+              <w:spacing w:after="40"/>
+            </w:pPr>
+            <w:r/>
+            <w:r>
+              <w:rPr>
+                <w:rFonts w:ascii="Arial" w:hAnsi="Arial"/>
+                <w:b w:val="0"/>
+                <w:color w:val="1A1410"/>
+                <w:sz w:val="20"/>
+              </w:rPr>
+              <w:t>The one item here that is not IT. An administrator can set Proximate’s monthly AI spend cap in the console at /admin/cost-ceiling — no developer needed.</w:t>
             </w:r>
           </w:p>
         </w:tc>
@@ -1200,7 +1386,7 @@
         <w:pStyle w:val="Heading1"/>
       </w:pPr>
       <w:r>
-        <w:t>What this wave adds to that list</w:t>
+        <w:t>And two things for the Proximate team</w:t>
       </w:r>
     </w:p>
     <w:tbl>

</xml_diff>

<commit_message>
docs: correct Platform Update Arabic claim (attention-list follow-up)
The 27 July team doc claimed "every operator screen reads in Arabic".
The review found that was true of fixed screen text but not of the live
"needs your attention" list, whose labels are server-generated and were
still English. This revision names the gap honestly and records that the
follow-up (build cf565cd95) localized those labels, closing the last
English-only operator surface. Build hash and How-checked updated.

Co-Authored-By: Claude Opus 4.8 <noreply@anthropic.com>
</commit_message>
<xml_diff>
--- a/docs/Platform_Update_Proximate_27_July_2026.docx
+++ b/docs/Platform_Update_Proximate_27_July_2026.docx
@@ -526,6 +526,21 @@
           <w:sz w:val="21"/>
         </w:rPr>
         <w:t>An honest note on this. For Proximate what matters is Arabic and English, and both are now complete across every screen. The Arabic is translated to a high standard but has still not been read by a native Sudanese speaker — that review, flagged last time, is now larger and still owed. The other four languages this time carry real translations rather than English placeholders; those are a first pass, also awaiting review, and they are not screens Proximate uses.</w:t>
+      </w:r>
+    </w:p>
+    <w:p>
+      <w:pPr>
+        <w:spacing w:after="160"/>
+      </w:pPr>
+      <w:r>
+        <w:rPr>
+          <w:rFonts w:ascii="Arial" w:hAnsi="Arial"/>
+          <w:b w:val="0"/>
+          <w:i w:val="0"/>
+          <w:color w:val="1A1410"/>
+          <w:sz w:val="21"/>
+        </w:rPr>
+        <w:t>One correction, because your review caught it and we would rather name it than let it pass. The first version of this note said every operator screen read in Arabic. That was true of the fixed text on every screen, but not of one class we had missed: the live “needs your attention” list on the operator home. Those lines — the severity of an item, the kind of an intervention (freeze, suspend), the type of a grievance, the “response window passed” and “needs triage” prompts — are written by the system as events happen rather than being baked into the page, and they were still in English on the build you tested. A follow-up, in the build named at the foot of this note, localizes them too. The attention list now reads in Arabic like the rest, and still falls back to plain English if a label is ever missing, rather than showing a code. It was the last English-only surface an operator could reach; it is closed now.</w:t>
       </w:r>
     </w:p>
     <w:p>
@@ -1642,7 +1657,7 @@
           <w:color w:val="1A1410"/>
           <w:sz w:val="21"/>
         </w:rPr>
-        <w:t>Language: every screen compiles; 939 new strings are present in all six languages with no drift, and a check confirms every placeholder ({name}, {amount}, and so on) survived translation intact. The live site was confirmed to be serving the new Arabic text, and loads with no errors.</w:t>
+        <w:t>Language: every screen compiles; the static strings plus the 27 new attention-list labels are present in all six languages with no drift, and a check confirms every placeholder ({name}, {amount}, and so on) survived translation intact. The live site was confirmed to be serving the new Arabic text — including the attention-list labels — and loads with no errors. The security matrix still passes with the attention list localized, so nothing about who can see it changed.</w:t>
       </w:r>
     </w:p>
     <w:p>
@@ -1657,7 +1672,7 @@
           <w:color w:val="57534E"/>
           <w:sz w:val="20"/>
         </w:rPr>
-        <w:t>Deployed and running as build ae7db8ec2 — the workflow fixes and the language completion. A documentation-only commit (f9d02398) sits on top.</w:t>
+        <w:t>Deployed and running as build cf565cd95 — the workflow fixes, the language completion, and the attention-list follow-up that closed the one English-only surface your review found.</w:t>
       </w:r>
     </w:p>
     <w:sectPr>

</xml_diff>

<commit_message>
docs: team update — add the two pilot-review follow-ups (test partner + standing checks)
Adds a plain-language section 5 covering the permanent "QA Fixture" test
partner/round (with a "please don't delete it" callout, since the team will
see it in the live lists) and the standing pre-release checks that now guard
the attention-list/audit-export/disbursement-readiness class. Build ref and
How-checked counts updated (regression 124/124, matrix 29 checks).

Co-Authored-By: Claude Opus 4.8 <noreply@anthropic.com>
</commit_message>
<xml_diff>
--- a/docs/Platform_Update_Proximate_27_July_2026.docx
+++ b/docs/Platform_Update_Proximate_27_July_2026.docx
@@ -541,6 +541,132 @@
           <w:sz w:val="21"/>
         </w:rPr>
         <w:t>One correction, because your review caught it and we would rather name it than let it pass. The first version of this note said every operator screen read in Arabic. That was true of the fixed text on every screen, but not of one class we had missed: the live “needs your attention” list on the operator home. Those lines — the severity of an item, the kind of an intervention (freeze, suspend), the type of a grievance, the “response window passed” and “needs triage” prompts — are written by the system as events happen rather than being baked into the page, and they were still in English on the build you tested. A follow-up, in the build named at the foot of this note, localizes them too. The attention list now reads in Arabic like the rest, and still falls back to plain English if a label is ever missing, rather than showing a code. It was the last English-only surface an operator could reach; it is closed now.</w:t>
+      </w:r>
+    </w:p>
+    <w:p>
+      <w:pPr>
+        <w:pStyle w:val="Heading2"/>
+      </w:pPr>
+      <w:r>
+        <w:t>5. Two more things your review asked for</w:t>
+      </w:r>
+    </w:p>
+    <w:p>
+      <w:pPr>
+        <w:spacing w:after="160"/>
+      </w:pPr>
+      <w:r>
+        <w:rPr>
+          <w:rFonts w:ascii="Arial" w:hAnsi="Arial"/>
+          <w:b w:val="0"/>
+          <w:i w:val="0"/>
+          <w:color w:val="1A1410"/>
+          <w:sz w:val="21"/>
+        </w:rPr>
+        <w:t>Your review made two suggestions beyond the fixes above, and both are now done.</w:t>
+      </w:r>
+    </w:p>
+    <w:p>
+      <w:pPr>
+        <w:spacing w:after="160"/>
+      </w:pPr>
+      <w:r>
+        <w:rPr>
+          <w:rFonts w:ascii="Arial" w:hAnsi="Arial"/>
+          <w:b w:val="0"/>
+          <w:i w:val="0"/>
+          <w:color w:val="1A1410"/>
+          <w:sz w:val="21"/>
+        </w:rPr>
+        <w:t xml:space="preserve">The first: a permanent “ready to pay” test partner. When you want to rehearse a disbursement — to see the screens, the readiness checklist, the sign-off — you need a partner who is fully cleared and awarded but has not yet been paid. Until now there wasn’t one standing by, so each rehearsal meant building that state by hand and then clearing it up afterwards. There is now a permanent one that always sits in exactly that state. You will see it in the partner and round lists as </w:t>
+      </w:r>
+    </w:p>
+    <w:p>
+      <w:pPr>
+        <w:spacing w:after="80"/>
+      </w:pPr>
+      <w:r>
+        <w:rPr>
+          <w:rFonts w:ascii="Arial" w:hAnsi="Arial"/>
+          <w:b w:val="0"/>
+          <w:i/>
+          <w:color w:val="1A1410"/>
+          <w:sz w:val="21"/>
+        </w:rPr>
+        <w:t xml:space="preserve">    “QA Fixture Partner — Ready to Disburse”  and  “QA Fixture Round — Happy Path”,</w:t>
+      </w:r>
+    </w:p>
+    <w:p>
+      <w:pPr>
+        <w:spacing w:after="160"/>
+      </w:pPr>
+      <w:r>
+        <w:rPr>
+          <w:rFonts w:ascii="Arial" w:hAnsi="Arial"/>
+          <w:b w:val="0"/>
+          <w:i w:val="0"/>
+          <w:color w:val="1A1410"/>
+          <w:sz w:val="21"/>
+        </w:rPr>
+        <w:t>each carrying a small TEST tag. It is safe to rehearse a disbursement against it; no real money is ever attached to it. Please leave it in place — it is there on purpose, and it can never be confused with a real partner because of the name and the tag. If it is ever removed by accident, one command restores it.</w:t>
+      </w:r>
+    </w:p>
+    <w:tbl>
+      <w:tblPr>
+        <w:tblStyle w:val="TableGrid"/>
+        <w:tblW w:type="auto" w:w="0"/>
+        <w:tblLook w:firstColumn="1" w:firstRow="1" w:lastColumn="0" w:lastRow="0" w:noHBand="0" w:noVBand="1" w:val="04A0"/>
+      </w:tblPr>
+      <w:tblGrid>
+        <w:gridCol w:w="8640"/>
+      </w:tblGrid>
+      <w:tr>
+        <w:tc>
+          <w:tcPr>
+            <w:tcW w:type="dxa" w:w="8640"/>
+            <w:shd w:val="clear" w:fill="FBEDE6"/>
+          </w:tcPr>
+          <w:p>
+            <w:r/>
+            <w:r>
+              <w:rPr>
+                <w:rFonts w:ascii="Arial" w:hAnsi="Arial"/>
+                <w:b/>
+                <w:color w:val="C2410C"/>
+                <w:sz w:val="20"/>
+              </w:rPr>
+              <w:t xml:space="preserve">Please don’t — </w:t>
+            </w:r>
+            <w:r>
+              <w:rPr>
+                <w:rFonts w:ascii="Arial" w:hAnsi="Arial"/>
+                <w:color w:val="1A1410"/>
+                <w:sz w:val="20"/>
+              </w:rPr>
+              <w:t>delete or edit the “QA Fixture” partner or round. They are the standing rehearsal records. Everything real sits alongside them, untouched.</w:t>
+            </w:r>
+          </w:p>
+        </w:tc>
+      </w:tr>
+    </w:tbl>
+    <w:p>
+      <w:pPr>
+        <w:spacing w:after="40"/>
+      </w:pPr>
+    </w:p>
+    <w:p>
+      <w:pPr>
+        <w:spacing w:after="160"/>
+      </w:pPr>
+      <w:r>
+        <w:rPr>
+          <w:rFonts w:ascii="Arial" w:hAnsi="Arial"/>
+          <w:b w:val="0"/>
+          <w:i w:val="0"/>
+          <w:color w:val="1A1410"/>
+          <w:sz w:val="21"/>
+        </w:rPr>
+        <w:t>The second: the check that runs before every release now watches for the exact problem your review found. It confirms that the operator’s “needs attention” list is fully translatable, that the audit chain still refuses donors and platform administrators on both viewing and downloading, and that a cleared partner is genuinely ready to pay. If a future change re-introduces an English-only label on that list, or loosens the audit refusal, the release stops before it ships rather than waiting to be caught in a review. In plain terms: the thing you had to notice by hand, the system now notices on its own.</w:t>
       </w:r>
     </w:p>
     <w:p>
@@ -1629,7 +1755,7 @@
           <w:color w:val="1A1410"/>
           <w:sz w:val="21"/>
         </w:rPr>
-        <w:t>The security matrix (25 checks) passes: a donor and a platform administrator are refused on both reading and exporting the audit chain — including the exact “Export chain” action from your review — while the Oversight Body is allowed. Full regression, 117 of 117.</w:t>
+        <w:t>The security matrix (29 checks) passes: a donor and a platform administrator are refused on both reading and downloading the audit chain — including the exact “Export chain” action from your review — while the Oversight Body is allowed. Full regression, 124 of 124.</w:t>
       </w:r>
     </w:p>
     <w:p>
@@ -1657,7 +1783,35 @@
           <w:color w:val="1A1410"/>
           <w:sz w:val="21"/>
         </w:rPr>
-        <w:t>Language: every screen compiles; the static strings plus the 27 new attention-list labels are present in all six languages with no drift, and a check confirms every placeholder ({name}, {amount}, and so on) survived translation intact. The live site was confirmed to be serving the new Arabic text — including the attention-list labels — and loads with no errors. The security matrix still passes with the attention list localized, so nothing about who can see it changed.</w:t>
+        <w:t>Language: every screen compiles; the static strings plus the 27 new attention-list labels are present in all six languages with no drift, and a check confirms every placeholder ({name}, {amount}, and so on) survived translation intact. The live site was confirmed to be serving the new Arabic text — including the attention-list labels — and loads with no errors.</w:t>
+      </w:r>
+    </w:p>
+    <w:p>
+      <w:pPr>
+        <w:pStyle w:val="ListBullet"/>
+        <w:spacing w:after="80"/>
+      </w:pPr>
+      <w:r>
+        <w:rPr>
+          <w:rFonts w:ascii="Arial" w:hAnsi="Arial"/>
+          <w:color w:val="1A1410"/>
+          <w:sz w:val="21"/>
+        </w:rPr>
+        <w:t>The three things your review checked by hand are now in the standing pre-release check: the attention list must stay fully translatable, the audit chain must keep refusing donors and administrators on view and download, and a cleared partner must be genuinely ready to pay. A change that breaks any of them now stops before it ships.</w:t>
+      </w:r>
+    </w:p>
+    <w:p>
+      <w:pPr>
+        <w:pStyle w:val="ListBullet"/>
+        <w:spacing w:after="80"/>
+      </w:pPr>
+      <w:r>
+        <w:rPr>
+          <w:rFonts w:ascii="Arial" w:hAnsi="Arial"/>
+          <w:color w:val="1A1410"/>
+          <w:sz w:val="21"/>
+        </w:rPr>
+        <w:t>The permanent “QA Fixture” partner and round were confirmed on the live site to be cleared, awarded, and ready to disburse, with no money attached.</w:t>
       </w:r>
     </w:p>
     <w:p>
@@ -1672,7 +1826,7 @@
           <w:color w:val="57534E"/>
           <w:sz w:val="20"/>
         </w:rPr>
-        <w:t>Deployed and running as build cf565cd95 — the workflow fixes, the language completion, and the attention-list follow-up that closed the one English-only surface your review found.</w:t>
+        <w:t>Deployed and running as build 614c2d1d5 — the workflow fixes, the language completion, the attention-list follow-up that closed the last English-only surface, and the two items your review asked for (the standing “ready to pay” test partner and the pre-release checks that now watch for the problem you found).</w:t>
       </w:r>
     </w:p>
     <w:sectPr>

</xml_diff>